<commit_message>
fix(syndic): signature et cachet sur l'avis d'appel, déclarations de l'ancien propriétaire invisibles au portail
- Recette du 18/10 (M7), décision validée : l'avis d'appel de charges PDF et
  Word porte la signature et le cachet de l'émetteur, comme la quittance.
  Deux marqueurs DOCX, SIGNATURE_EMETTEUR et CACHET_EMETTEUR, sont injectés
  comme les logos (retirés proprement sans image) ; les modèles livrés de
  l'avis et de la quittance de charges sont régénérés ; un modèle d'agence
  sans ces marqueurs est inchangé.
- Portail copropriétaire : quand un lot a changé de propriétaire, les
  déclarations de paiement de l'ancien propriétaire ne sont plus visibles du
  nouveau (liste, total, détail, annulation, marqueur « déclaration en
  attente » sur les appels, blocage du paiement en ligne), avec le même 404
  qu'une déclaration inexistante.

Co-Authored-By: Claude Opus 5.5 <noreply@anthropic.com>
</commit_message>
<xml_diff>
--- a/assets/modeles_standard/avis_appel_charges.docx
+++ b/assets/modeles_standard/avis_appel_charges.docx
@@ -1253,6 +1253,14 @@
           </w:p>
           <w:p>
             <w:pPr>
+              <w:spacing w:before="0" w:after="40" w:line="900" w:lineRule="atLeast"/>
+            </w:pPr>
+            <w:r>
+              <w:t xml:space="preserve">{{SIGNATURE_EMETTEUR}}  {{CACHET_EMETTEUR}}</w:t>
+            </w:r>
+          </w:p>
+          <w:p>
+            <w:pPr>
               <w:spacing w:before="0" w:after="40" w:line="264" w:lineRule="auto"/>
             </w:pPr>
             <w:r>
@@ -1266,7 +1274,7 @@
           </w:p>
           <w:p>
             <w:pPr>
-              <w:spacing w:before="0" w:after="0" w:line="900" w:lineRule="exact"/>
+              <w:spacing w:before="0" w:after="0" w:line="60" w:lineRule="exact"/>
             </w:pPr>
           </w:p>
         </w:tc>

</xml_diff>